<commit_message>
refactor report.docx + report.pdf
</commit_message>
<xml_diff>
--- a/МетодыВерификацииДЗ2_отчёт_ЗахаровАА932223.docx
+++ b/МетодыВерификацииДЗ2_отчёт_ЗахаровАА932223.docx
@@ -5161,148 +5161,100 @@
         <w:rPr>
           <w:lang w:val="en-AU"/>
         </w:rPr>
-        <w:t xml:space="preserve">:: (fin &amp; </w:t>
-      </w:r>
-      <w:proofErr w:type="spellStart"/>
+        <w:t>:: (fin &amp; gc &amp; wg) -&gt; break;</w:t>
+      </w:r>
+    </w:p>
+    <w:p>
+      <w:pPr>
+        <w:pStyle w:val="a7"/>
+      </w:pPr>
+      <w:r>
+        <w:rPr>
+          <w:lang w:val="en-AU"/>
+        </w:rPr>
+        <w:tab/>
+      </w:r>
+      <w:r>
+        <w:rPr>
+          <w:lang w:val="en-AU"/>
+        </w:rPr>
+        <w:tab/>
+      </w:r>
+      <w:r>
+        <w:t xml:space="preserve">:: </w:t>
+      </w:r>
+      <w:r>
+        <w:rPr>
+          <w:lang w:val="en-AU"/>
+        </w:rPr>
+        <w:t>else</w:t>
+      </w:r>
+    </w:p>
+    <w:p>
+      <w:pPr>
+        <w:pStyle w:val="a7"/>
+      </w:pPr>
+      <w:r>
+        <w:tab/>
+      </w:r>
+      <w:r>
+        <w:rPr>
+          <w:lang w:val="en-AU"/>
+        </w:rPr>
+        <w:t>o</w:t>
+      </w:r>
+      <w:r>
+        <w:rPr>
+          <w:lang w:val="en-AU"/>
+        </w:rPr>
+        <w:t>d</w:t>
+      </w:r>
+      <w:r>
+        <w:t>;</w:t>
+      </w:r>
+      <w:r>
+        <w:tab/>
+      </w:r>
+    </w:p>
+    <w:p>
+      <w:pPr>
+        <w:pStyle w:val="a7"/>
+      </w:pPr>
+      <w:r>
+        <w:t>}</w:t>
+      </w:r>
+    </w:p>
+    <w:p>
+      <w:pPr>
+        <w:pStyle w:val="a7"/>
+      </w:pPr>
+      <w:r>
+        <w:t xml:space="preserve">Ошибочным состоянием здесь является состояние, в которое можем попасть только по условию </w:t>
+      </w:r>
+      <w:r>
+        <w:rPr>
+          <w:lang w:val="en-AU"/>
+        </w:rPr>
+        <w:t>fin</w:t>
+      </w:r>
+      <w:r>
+        <w:t xml:space="preserve"> &amp;&amp; </w:t>
+      </w:r>
       <w:r>
         <w:rPr>
           <w:lang w:val="en-AU"/>
         </w:rPr>
         <w:t>gc</w:t>
       </w:r>
-      <w:proofErr w:type="spellEnd"/>
-      <w:r>
-        <w:rPr>
-          <w:lang w:val="en-AU"/>
-        </w:rPr>
-        <w:t xml:space="preserve"> &amp; </w:t>
-      </w:r>
-      <w:proofErr w:type="spellStart"/>
+      <w:r>
+        <w:t xml:space="preserve"> &amp;&amp; </w:t>
+      </w:r>
       <w:r>
         <w:rPr>
           <w:lang w:val="en-AU"/>
         </w:rPr>
         <w:t>wg</w:t>
       </w:r>
-      <w:proofErr w:type="spellEnd"/>
-      <w:r>
-        <w:rPr>
-          <w:lang w:val="en-AU"/>
-        </w:rPr>
-        <w:t>) -&gt; break;</w:t>
-      </w:r>
-    </w:p>
-    <w:p>
-      <w:pPr>
-        <w:pStyle w:val="a7"/>
-        <w:rPr>
-          <w:lang w:val="en-AU"/>
-        </w:rPr>
-      </w:pPr>
-      <w:r>
-        <w:rPr>
-          <w:lang w:val="en-AU"/>
-        </w:rPr>
-        <w:tab/>
-      </w:r>
-      <w:r>
-        <w:rPr>
-          <w:lang w:val="en-AU"/>
-        </w:rPr>
-        <w:tab/>
-        <w:t>:: else</w:t>
-      </w:r>
-    </w:p>
-    <w:p>
-      <w:pPr>
-        <w:pStyle w:val="a7"/>
-        <w:rPr>
-          <w:lang w:val="en-AU"/>
-        </w:rPr>
-      </w:pPr>
-      <w:r>
-        <w:rPr>
-          <w:lang w:val="en-AU"/>
-        </w:rPr>
-        <w:tab/>
-      </w:r>
-      <w:r>
-        <w:rPr>
-          <w:lang w:val="en-AU"/>
-        </w:rPr>
-        <w:t>o</w:t>
-      </w:r>
-      <w:r>
-        <w:rPr>
-          <w:lang w:val="en-AU"/>
-        </w:rPr>
-        <w:t>d</w:t>
-      </w:r>
-      <w:r>
-        <w:rPr>
-          <w:lang w:val="en-AU"/>
-        </w:rPr>
-        <w:t>;</w:t>
-      </w:r>
-      <w:r>
-        <w:rPr>
-          <w:lang w:val="en-AU"/>
-        </w:rPr>
-        <w:tab/>
-      </w:r>
-    </w:p>
-    <w:p>
-      <w:pPr>
-        <w:pStyle w:val="a7"/>
-        <w:rPr>
-          <w:lang w:val="en-AU"/>
-        </w:rPr>
-      </w:pPr>
-      <w:r>
-        <w:rPr>
-          <w:lang w:val="en-AU"/>
-        </w:rPr>
-        <w:t>}</w:t>
-      </w:r>
-    </w:p>
-    <w:p>
-      <w:pPr>
-        <w:pStyle w:val="a7"/>
-        <w:rPr>
-          <w:lang w:val="en-AU"/>
-        </w:rPr>
-      </w:pPr>
-      <w:r>
-        <w:t xml:space="preserve">Ошибочным состоянием здесь является состояние, в которое можем попасть только по условию </w:t>
-      </w:r>
-      <w:r>
-        <w:rPr>
-          <w:lang w:val="en-AU"/>
-        </w:rPr>
-        <w:t>fin</w:t>
-      </w:r>
-      <w:r>
-        <w:t xml:space="preserve"> &amp;&amp; </w:t>
-      </w:r>
-      <w:proofErr w:type="spellStart"/>
-      <w:r>
-        <w:rPr>
-          <w:lang w:val="en-AU"/>
-        </w:rPr>
-        <w:t>gc</w:t>
-      </w:r>
-      <w:proofErr w:type="spellEnd"/>
-      <w:r>
-        <w:t xml:space="preserve"> &amp;&amp; </w:t>
-      </w:r>
-      <w:proofErr w:type="spellStart"/>
-      <w:r>
-        <w:rPr>
-          <w:lang w:val="en-AU"/>
-        </w:rPr>
-        <w:t>wg</w:t>
-      </w:r>
-      <w:proofErr w:type="spellEnd"/>
       <w:r>
         <w:t xml:space="preserve"> == </w:t>
       </w:r>
@@ -5553,6 +5505,9 @@
         </w:rPr>
       </w:pPr>
       <w:r>
+        <w:rPr>
+          <w:noProof/>
+        </w:rPr>
         <w:drawing>
           <wp:inline distT="0" distB="0" distL="0" distR="0" wp14:anchorId="57B64BBD" wp14:editId="00FCBA56">
             <wp:extent cx="3346450" cy="2576089"/>
@@ -5596,6 +5551,7 @@
       </w:pPr>
       <w:r>
         <w:rPr>
+          <w:noProof/>
           <w:lang w:val="en-AU"/>
         </w:rPr>
         <w:drawing>
@@ -5651,97 +5607,28 @@
     <w:p>
       <w:pPr>
         <w:pStyle w:val="a7"/>
-        <w:rPr>
-          <w:lang w:val="en-AU"/>
-        </w:rPr>
-      </w:pPr>
-      <w:r>
+      </w:pPr>
+      <w:r>
+        <w:rPr>
+          <w:lang w:val="en-AU"/>
+        </w:rPr>
         <w:lastRenderedPageBreak/>
         <w:t>ltl {!(&lt;&gt; fin &amp;&amp; []( wg &amp;&amp; gc ) )}</w:t>
       </w:r>
     </w:p>
     <w:p>
       <w:pPr>
-        <w:shd w:val="clear" w:color="auto" w:fill="121314"/>
-        <w:spacing w:after="0" w:line="285" w:lineRule="atLeast"/>
-        <w:rPr>
-          <w:rFonts w:ascii="Consolas" w:eastAsia="Times New Roman" w:hAnsi="Consolas" w:cs="Times New Roman"/>
-          <w:color w:val="569CD6"/>
-          <w:kern w:val="0"/>
-          <w:sz w:val="21"/>
-          <w:szCs w:val="21"/>
-          <w:lang w:val="en-AU" w:eastAsia="ru-RU"/>
-          <w14:ligatures w14:val="none"/>
-        </w:rPr>
-      </w:pPr>
-      <w:r>
-        <w:rPr>
-          <w:lang w:val="en-AU"/>
-        </w:rPr>
-        <w:t>not(</w:t>
-      </w:r>
-      <w:r>
-        <w:rPr>
-          <w:lang w:val="en-AU"/>
-        </w:rPr>
-        <w:t xml:space="preserve"> </w:t>
-      </w:r>
-      <w:r>
-        <w:rPr>
-          <w:lang w:val="en-AU"/>
-        </w:rPr>
-        <w:t xml:space="preserve">eventually ( </w:t>
-      </w:r>
-      <w:r>
-        <w:rPr>
-          <w:rFonts w:ascii="Consolas" w:eastAsia="Times New Roman" w:hAnsi="Consolas" w:cs="Times New Roman"/>
-          <w:color w:val="BBBEBF"/>
-          <w:kern w:val="0"/>
-          <w:sz w:val="21"/>
-          <w:szCs w:val="21"/>
-          <w:highlight w:val="black"/>
-          <w:lang w:val="en-AU" w:eastAsia="ru-RU"/>
-          <w14:ligatures w14:val="none"/>
-        </w:rPr>
-        <w:t>all_right_side ==</w:t>
-      </w:r>
-      <w:r>
-        <w:rPr>
-          <w:rFonts w:ascii="Consolas" w:eastAsia="Times New Roman" w:hAnsi="Consolas" w:cs="Times New Roman"/>
-          <w:color w:val="569CD6"/>
-          <w:kern w:val="0"/>
-          <w:sz w:val="21"/>
-          <w:szCs w:val="21"/>
-          <w:highlight w:val="black"/>
-          <w:lang w:val="en-AU" w:eastAsia="ru-RU"/>
-          <w14:ligatures w14:val="none"/>
-        </w:rPr>
-        <w:t>true</w:t>
-      </w:r>
-      <w:r>
-        <w:rPr>
-          <w:rFonts w:ascii="Consolas" w:eastAsia="Times New Roman" w:hAnsi="Consolas" w:cs="Times New Roman"/>
-          <w:color w:val="569CD6"/>
-          <w:kern w:val="0"/>
-          <w:sz w:val="21"/>
-          <w:szCs w:val="21"/>
-          <w:lang w:val="en-AU" w:eastAsia="ru-RU"/>
-          <w14:ligatures w14:val="none"/>
-        </w:rPr>
-        <w:t xml:space="preserve"> </w:t>
-      </w:r>
-      <w:r>
-        <w:rPr>
-          <w:lang w:val="en-AU"/>
-        </w:rPr>
-        <w:t xml:space="preserve">) </w:t>
-      </w:r>
-      <w:r>
+        <w:pStyle w:val="a7"/>
+      </w:pPr>
+      <w:r>
+        <w:rPr>
+          <w:noProof/>
+        </w:rPr>
         <w:drawing>
-          <wp:inline distT="0" distB="0" distL="0" distR="0" wp14:anchorId="3D2A9760" wp14:editId="25FE1F22">
+          <wp:inline distT="0" distB="0" distL="0" distR="0" wp14:anchorId="5FA52B92" wp14:editId="014F8E39">
             <wp:extent cx="5315692" cy="2629267"/>
             <wp:effectExtent l="0" t="0" r="0" b="0"/>
-            <wp:docPr id="584483943" name="Рисунок 1"/>
+            <wp:docPr id="584483943" name="Рисунок 1" descr="Изображение выглядит как текст, снимок экрана, Шрифт, Цвет электрик&#10;&#10;Содержимое, созданное искусственным интеллектом, может быть неверным."/>
             <wp:cNvGraphicFramePr>
               <a:graphicFrameLocks xmlns:a="http://schemas.openxmlformats.org/drawingml/2006/main" noChangeAspect="1"/>
             </wp:cNvGraphicFramePr>
@@ -5749,7 +5636,7 @@
               <a:graphicData uri="http://schemas.openxmlformats.org/drawingml/2006/picture">
                 <pic:pic xmlns:pic="http://schemas.openxmlformats.org/drawingml/2006/picture">
                   <pic:nvPicPr>
-                    <pic:cNvPr id="584483943" name=""/>
+                    <pic:cNvPr id="584483943" name="Рисунок 1" descr="Изображение выглядит как текст, снимок экрана, Шрифт, Цвет электрик&#10;&#10;Содержимое, созданное искусственным интеллектом, может быть неверным."/>
                     <pic:cNvPicPr/>
                   </pic:nvPicPr>
                   <pic:blipFill>
@@ -5773,13 +5660,11 @@
           </wp:inline>
         </w:drawing>
       </w:r>
-      <w:r>
-        <w:rPr>
-          <w:lang w:val="en-AU"/>
-        </w:rPr>
-        <w:t>&amp;&amp;</w:t>
-      </w:r>
-      <w:r>
+    </w:p>
+    <w:p>
+      <w:pPr>
+        <w:shd w:val="clear" w:color="auto" w:fill="121314"/>
+        <w:spacing w:after="0" w:line="285" w:lineRule="atLeast"/>
         <w:rPr>
           <w:rFonts w:ascii="Consolas" w:eastAsia="Times New Roman" w:hAnsi="Consolas" w:cs="Times New Roman"/>
           <w:color w:val="569CD6"/>
@@ -5789,171 +5674,24 @@
           <w:lang w:val="en-AU" w:eastAsia="ru-RU"/>
           <w14:ligatures w14:val="none"/>
         </w:rPr>
+      </w:pPr>
+      <w:r>
+        <w:rPr>
+          <w:lang w:val="en-AU"/>
+        </w:rPr>
+        <w:t>not(</w:t>
+      </w:r>
+      <w:r>
+        <w:rPr>
+          <w:lang w:val="en-AU"/>
+        </w:rPr>
         <w:t xml:space="preserve"> </w:t>
       </w:r>
-    </w:p>
-    <w:p>
-      <w:pPr>
-        <w:shd w:val="clear" w:color="auto" w:fill="121314"/>
-        <w:spacing w:after="0" w:line="285" w:lineRule="atLeast"/>
-        <w:rPr>
-          <w:rFonts w:ascii="Consolas" w:eastAsia="Times New Roman" w:hAnsi="Consolas" w:cs="Times New Roman"/>
-          <w:color w:val="BBBEBF"/>
-          <w:kern w:val="0"/>
-          <w:sz w:val="21"/>
-          <w:szCs w:val="21"/>
-          <w:lang w:eastAsia="ru-RU"/>
-          <w14:ligatures w14:val="none"/>
-        </w:rPr>
-      </w:pPr>
-      <w:r>
-        <w:rPr>
-          <w:lang w:val="en-AU"/>
-        </w:rPr>
-        <w:t>always (</w:t>
-      </w:r>
-      <w:r>
-        <w:rPr>
-          <w:lang w:val="en-AU"/>
-        </w:rPr>
-        <w:t xml:space="preserve"> </w:t>
-      </w:r>
-      <w:r>
-        <w:rPr>
-          <w:rFonts w:ascii="Consolas" w:eastAsia="Times New Roman" w:hAnsi="Consolas" w:cs="Times New Roman"/>
-          <w:color w:val="BBBEBF"/>
-          <w:kern w:val="0"/>
-          <w:sz w:val="21"/>
-          <w:szCs w:val="21"/>
-          <w:lang w:val="en-AU" w:eastAsia="ru-RU"/>
-          <w14:ligatures w14:val="none"/>
-        </w:rPr>
-        <w:t xml:space="preserve">(g_and_c == </w:t>
-      </w:r>
-      <w:r>
-        <w:rPr>
-          <w:rFonts w:ascii="Consolas" w:eastAsia="Times New Roman" w:hAnsi="Consolas" w:cs="Times New Roman"/>
-          <w:color w:val="569CD6"/>
-          <w:kern w:val="0"/>
-          <w:sz w:val="21"/>
-          <w:szCs w:val="21"/>
-          <w:lang w:val="en-AU" w:eastAsia="ru-RU"/>
-          <w14:ligatures w14:val="none"/>
-        </w:rPr>
-        <w:t>false</w:t>
-      </w:r>
-      <w:r>
-        <w:rPr>
-          <w:rFonts w:ascii="Consolas" w:eastAsia="Times New Roman" w:hAnsi="Consolas" w:cs="Times New Roman"/>
-          <w:color w:val="BBBEBF"/>
-          <w:kern w:val="0"/>
-          <w:sz w:val="21"/>
-          <w:szCs w:val="21"/>
-          <w:lang w:val="en-AU" w:eastAsia="ru-RU"/>
-          <w14:ligatures w14:val="none"/>
-        </w:rPr>
-        <w:t xml:space="preserve">) &amp;&amp; (w_and_g == </w:t>
-      </w:r>
-      <w:r>
-        <w:rPr>
-          <w:rFonts w:ascii="Consolas" w:eastAsia="Times New Roman" w:hAnsi="Consolas" w:cs="Times New Roman"/>
-          <w:color w:val="569CD6"/>
-          <w:kern w:val="0"/>
-          <w:sz w:val="21"/>
-          <w:szCs w:val="21"/>
-          <w:lang w:val="en-AU" w:eastAsia="ru-RU"/>
-          <w14:ligatures w14:val="none"/>
-        </w:rPr>
-        <w:t>false</w:t>
-      </w:r>
-      <w:r>
-        <w:rPr>
-          <w:rFonts w:ascii="Consolas" w:eastAsia="Times New Roman" w:hAnsi="Consolas" w:cs="Times New Roman"/>
-          <w:color w:val="BBBEBF"/>
-          <w:kern w:val="0"/>
-          <w:sz w:val="21"/>
-          <w:szCs w:val="21"/>
-          <w:lang w:val="en-AU" w:eastAsia="ru-RU"/>
-          <w14:ligatures w14:val="none"/>
-        </w:rPr>
-        <w:t>)</w:t>
-      </w:r>
-      <w:r>
-        <w:rPr>
-          <w:rFonts w:ascii="Consolas" w:eastAsia="Times New Roman" w:hAnsi="Consolas" w:cs="Times New Roman"/>
-          <w:color w:val="BBBEBF"/>
-          <w:kern w:val="0"/>
-          <w:sz w:val="21"/>
-          <w:szCs w:val="21"/>
-          <w:lang w:val="en-AU" w:eastAsia="ru-RU"/>
-          <w14:ligatures w14:val="none"/>
-        </w:rPr>
-        <w:t>)</w:t>
-      </w:r>
-      <w:r>
-        <w:rPr>
-          <w:rFonts w:ascii="Consolas" w:eastAsia="Times New Roman" w:hAnsi="Consolas" w:cs="Times New Roman"/>
-          <w:color w:val="BBBEBF"/>
-          <w:kern w:val="0"/>
-          <w:sz w:val="21"/>
-          <w:szCs w:val="21"/>
-          <w:lang w:val="en-AU" w:eastAsia="ru-RU"/>
-          <w14:ligatures w14:val="none"/>
-        </w:rPr>
-        <w:t>)</w:t>
-      </w:r>
-    </w:p>
-    <w:p>
-      <w:pPr>
-        <w:rPr>
-          <w:lang w:eastAsia="ru-RU"/>
-        </w:rPr>
-      </w:pPr>
-    </w:p>
-    <w:p>
-      <w:pPr>
-        <w:rPr>
-          <w:b/>
-          <w:bCs/>
-        </w:rPr>
-      </w:pPr>
-      <w:r>
-        <w:rPr>
-          <w:lang w:eastAsia="ru-RU"/>
-        </w:rPr>
-        <w:t xml:space="preserve">То есть </w:t>
-      </w:r>
-      <w:r>
-        <w:rPr>
-          <w:b/>
-          <w:bCs/>
-          <w:lang w:eastAsia="ru-RU"/>
-        </w:rPr>
-        <w:t>отрицание(</w:t>
-      </w:r>
-      <w:r>
-        <w:rPr>
-          <w:b/>
-          <w:bCs/>
-          <w:lang w:eastAsia="ru-RU"/>
-        </w:rPr>
-        <w:t xml:space="preserve"> </w:t>
-      </w:r>
-      <w:r>
-        <w:rPr>
-          <w:b/>
-          <w:bCs/>
-          <w:lang w:eastAsia="ru-RU"/>
-        </w:rPr>
-        <w:t>случится</w:t>
-      </w:r>
-      <w:r>
-        <w:rPr>
-          <w:b/>
-          <w:bCs/>
-          <w:lang w:eastAsia="ru-RU"/>
-        </w:rPr>
-        <w:t>(</w:t>
+      <w:r>
+        <w:rPr>
+          <w:lang w:val="en-AU"/>
+        </w:rPr>
+        <w:t xml:space="preserve">eventually ( </w:t>
       </w:r>
       <w:r>
         <w:rPr>
@@ -5966,25 +5704,12 @@
           <w:lang w:val="en-AU" w:eastAsia="ru-RU"/>
           <w14:ligatures w14:val="none"/>
         </w:rPr>
-        <w:t>all</w:t>
+        <w:t>all_right_side ==</w:t>
       </w:r>
       <w:r>
         <w:rPr>
           <w:rFonts w:ascii="Consolas" w:eastAsia="Times New Roman" w:hAnsi="Consolas" w:cs="Times New Roman"/>
-          <w:color w:val="BBBEBF"/>
-          <w:kern w:val="0"/>
-          <w:sz w:val="21"/>
-          <w:szCs w:val="21"/>
-          <w:highlight w:val="black"/>
-          <w:lang w:eastAsia="ru-RU"/>
-          <w14:ligatures w14:val="none"/>
-        </w:rPr>
-        <w:t>_</w:t>
-      </w:r>
-      <w:r>
-        <w:rPr>
-          <w:rFonts w:ascii="Consolas" w:eastAsia="Times New Roman" w:hAnsi="Consolas" w:cs="Times New Roman"/>
-          <w:color w:val="BBBEBF"/>
+          <w:color w:val="569CD6"/>
           <w:kern w:val="0"/>
           <w:sz w:val="21"/>
           <w:szCs w:val="21"/>
@@ -5992,20 +5717,189 @@
           <w:lang w:val="en-AU" w:eastAsia="ru-RU"/>
           <w14:ligatures w14:val="none"/>
         </w:rPr>
-        <w:t>right</w:t>
-      </w:r>
-      <w:r>
+        <w:t>true</w:t>
+      </w:r>
+      <w:r>
+        <w:rPr>
+          <w:rFonts w:ascii="Consolas" w:eastAsia="Times New Roman" w:hAnsi="Consolas" w:cs="Times New Roman"/>
+          <w:color w:val="569CD6"/>
+          <w:kern w:val="0"/>
+          <w:sz w:val="21"/>
+          <w:szCs w:val="21"/>
+          <w:lang w:val="en-AU" w:eastAsia="ru-RU"/>
+          <w14:ligatures w14:val="none"/>
+        </w:rPr>
+        <w:t xml:space="preserve"> </w:t>
+      </w:r>
+      <w:r>
+        <w:rPr>
+          <w:lang w:val="en-AU"/>
+        </w:rPr>
+        <w:t>) &amp;&amp;</w:t>
+      </w:r>
+      <w:r>
+        <w:rPr>
+          <w:rFonts w:ascii="Consolas" w:eastAsia="Times New Roman" w:hAnsi="Consolas" w:cs="Times New Roman"/>
+          <w:color w:val="569CD6"/>
+          <w:kern w:val="0"/>
+          <w:sz w:val="21"/>
+          <w:szCs w:val="21"/>
+          <w:lang w:val="en-AU" w:eastAsia="ru-RU"/>
+          <w14:ligatures w14:val="none"/>
+        </w:rPr>
+        <w:t xml:space="preserve"> </w:t>
+      </w:r>
+    </w:p>
+    <w:p>
+      <w:pPr>
+        <w:shd w:val="clear" w:color="auto" w:fill="121314"/>
+        <w:spacing w:after="0" w:line="285" w:lineRule="atLeast"/>
         <w:rPr>
           <w:rFonts w:ascii="Consolas" w:eastAsia="Times New Roman" w:hAnsi="Consolas" w:cs="Times New Roman"/>
           <w:color w:val="BBBEBF"/>
           <w:kern w:val="0"/>
           <w:sz w:val="21"/>
           <w:szCs w:val="21"/>
-          <w:highlight w:val="black"/>
-          <w:lang w:eastAsia="ru-RU"/>
-          <w14:ligatures w14:val="none"/>
-        </w:rPr>
-        <w:t>_</w:t>
+          <w:lang w:val="en-AU" w:eastAsia="ru-RU"/>
+          <w14:ligatures w14:val="none"/>
+        </w:rPr>
+      </w:pPr>
+      <w:r>
+        <w:rPr>
+          <w:lang w:val="en-AU"/>
+        </w:rPr>
+        <w:t>always (</w:t>
+      </w:r>
+      <w:r>
+        <w:rPr>
+          <w:lang w:val="en-AU"/>
+        </w:rPr>
+        <w:t xml:space="preserve"> </w:t>
+      </w:r>
+      <w:r>
+        <w:rPr>
+          <w:rFonts w:ascii="Consolas" w:eastAsia="Times New Roman" w:hAnsi="Consolas" w:cs="Times New Roman"/>
+          <w:color w:val="BBBEBF"/>
+          <w:kern w:val="0"/>
+          <w:sz w:val="21"/>
+          <w:szCs w:val="21"/>
+          <w:lang w:val="en-AU" w:eastAsia="ru-RU"/>
+          <w14:ligatures w14:val="none"/>
+        </w:rPr>
+        <w:t xml:space="preserve">(g_and_c == </w:t>
+      </w:r>
+      <w:r>
+        <w:rPr>
+          <w:rFonts w:ascii="Consolas" w:eastAsia="Times New Roman" w:hAnsi="Consolas" w:cs="Times New Roman"/>
+          <w:color w:val="569CD6"/>
+          <w:kern w:val="0"/>
+          <w:sz w:val="21"/>
+          <w:szCs w:val="21"/>
+          <w:lang w:val="en-AU" w:eastAsia="ru-RU"/>
+          <w14:ligatures w14:val="none"/>
+        </w:rPr>
+        <w:t>false</w:t>
+      </w:r>
+      <w:r>
+        <w:rPr>
+          <w:rFonts w:ascii="Consolas" w:eastAsia="Times New Roman" w:hAnsi="Consolas" w:cs="Times New Roman"/>
+          <w:color w:val="BBBEBF"/>
+          <w:kern w:val="0"/>
+          <w:sz w:val="21"/>
+          <w:szCs w:val="21"/>
+          <w:lang w:val="en-AU" w:eastAsia="ru-RU"/>
+          <w14:ligatures w14:val="none"/>
+        </w:rPr>
+        <w:t xml:space="preserve">) &amp;&amp; (w_and_g == </w:t>
+      </w:r>
+      <w:r>
+        <w:rPr>
+          <w:rFonts w:ascii="Consolas" w:eastAsia="Times New Roman" w:hAnsi="Consolas" w:cs="Times New Roman"/>
+          <w:color w:val="569CD6"/>
+          <w:kern w:val="0"/>
+          <w:sz w:val="21"/>
+          <w:szCs w:val="21"/>
+          <w:lang w:val="en-AU" w:eastAsia="ru-RU"/>
+          <w14:ligatures w14:val="none"/>
+        </w:rPr>
+        <w:t>false</w:t>
+      </w:r>
+      <w:r>
+        <w:rPr>
+          <w:rFonts w:ascii="Consolas" w:eastAsia="Times New Roman" w:hAnsi="Consolas" w:cs="Times New Roman"/>
+          <w:color w:val="BBBEBF"/>
+          <w:kern w:val="0"/>
+          <w:sz w:val="21"/>
+          <w:szCs w:val="21"/>
+          <w:lang w:val="en-AU" w:eastAsia="ru-RU"/>
+          <w14:ligatures w14:val="none"/>
+        </w:rPr>
+        <w:t>)</w:t>
+      </w:r>
+      <w:r>
+        <w:rPr>
+          <w:rFonts w:ascii="Consolas" w:eastAsia="Times New Roman" w:hAnsi="Consolas" w:cs="Times New Roman"/>
+          <w:color w:val="BBBEBF"/>
+          <w:kern w:val="0"/>
+          <w:sz w:val="21"/>
+          <w:szCs w:val="21"/>
+          <w:lang w:val="en-AU" w:eastAsia="ru-RU"/>
+          <w14:ligatures w14:val="none"/>
+        </w:rPr>
+        <w:t>))</w:t>
+      </w:r>
+    </w:p>
+    <w:p>
+      <w:pPr>
+        <w:rPr>
+          <w:lang w:val="en-AU" w:eastAsia="ru-RU"/>
+        </w:rPr>
+      </w:pPr>
+    </w:p>
+    <w:p>
+      <w:pPr>
+        <w:rPr>
+          <w:b/>
+          <w:bCs/>
+        </w:rPr>
+      </w:pPr>
+      <w:r>
+        <w:rPr>
+          <w:lang w:eastAsia="ru-RU"/>
+        </w:rPr>
+        <w:t xml:space="preserve">То есть </w:t>
+      </w:r>
+      <w:r>
+        <w:rPr>
+          <w:b/>
+          <w:bCs/>
+          <w:lang w:eastAsia="ru-RU"/>
+        </w:rPr>
+        <w:t>отрицание(</w:t>
+      </w:r>
+      <w:r>
+        <w:rPr>
+          <w:b/>
+          <w:bCs/>
+          <w:lang w:eastAsia="ru-RU"/>
+        </w:rPr>
+        <w:t xml:space="preserve"> </w:t>
+      </w:r>
+      <w:r>
+        <w:rPr>
+          <w:b/>
+          <w:bCs/>
+          <w:lang w:eastAsia="ru-RU"/>
+        </w:rPr>
+        <w:t>случится</w:t>
+      </w:r>
+      <w:r>
+        <w:rPr>
+          <w:b/>
+          <w:bCs/>
+          <w:lang w:eastAsia="ru-RU"/>
+        </w:rPr>
+        <w:t>(</w:t>
       </w:r>
       <w:r>
         <w:rPr>
@@ -6018,7 +5912,7 @@
           <w:lang w:val="en-AU" w:eastAsia="ru-RU"/>
           <w14:ligatures w14:val="none"/>
         </w:rPr>
-        <w:t>side</w:t>
+        <w:t>all</w:t>
       </w:r>
       <w:r>
         <w:rPr>
@@ -6031,12 +5925,12 @@
           <w:lang w:eastAsia="ru-RU"/>
           <w14:ligatures w14:val="none"/>
         </w:rPr>
-        <w:t xml:space="preserve"> ==</w:t>
+        <w:t>_</w:t>
       </w:r>
       <w:r>
         <w:rPr>
           <w:rFonts w:ascii="Consolas" w:eastAsia="Times New Roman" w:hAnsi="Consolas" w:cs="Times New Roman"/>
-          <w:color w:val="569CD6"/>
+          <w:color w:val="BBBEBF"/>
           <w:kern w:val="0"/>
           <w:sz w:val="21"/>
           <w:szCs w:val="21"/>
@@ -6044,63 +5938,7 @@
           <w:lang w:val="en-AU" w:eastAsia="ru-RU"/>
           <w14:ligatures w14:val="none"/>
         </w:rPr>
-        <w:t>true</w:t>
-      </w:r>
-      <w:r>
-        <w:rPr>
-          <w:b/>
-          <w:bCs/>
-        </w:rPr>
-        <w:t>)</w:t>
-      </w:r>
-      <w:r>
-        <w:rPr>
-          <w:b/>
-          <w:bCs/>
-        </w:rPr>
-        <w:t xml:space="preserve"> И</w:t>
-      </w:r>
-      <w:r>
-        <w:rPr>
-          <w:b/>
-          <w:bCs/>
-        </w:rPr>
-        <w:br/>
-      </w:r>
-      <w:r>
-        <w:rPr>
-          <w:b/>
-          <w:bCs/>
-        </w:rPr>
-        <w:t xml:space="preserve"> </w:t>
-      </w:r>
-      <w:r>
-        <w:rPr>
-          <w:b/>
-          <w:bCs/>
-        </w:rPr>
-        <w:t>всегда</w:t>
-      </w:r>
-      <w:r>
-        <w:rPr>
-          <w:b/>
-          <w:bCs/>
-        </w:rPr>
-        <w:t>_</w:t>
-      </w:r>
-      <w:r>
-        <w:rPr>
-          <w:b/>
-          <w:bCs/>
-        </w:rPr>
-        <w:t>выполняется</w:t>
-      </w:r>
-      <w:r>
-        <w:rPr>
-          <w:b/>
-          <w:bCs/>
-        </w:rPr>
-        <w:t>(</w:t>
+        <w:t>right</w:t>
       </w:r>
       <w:r>
         <w:rPr>
@@ -6113,7 +5951,7 @@
           <w:lang w:eastAsia="ru-RU"/>
           <w14:ligatures w14:val="none"/>
         </w:rPr>
-        <w:t>(</w:t>
+        <w:t>_</w:t>
       </w:r>
       <w:r>
         <w:rPr>
@@ -6126,7 +5964,7 @@
           <w:lang w:val="en-AU" w:eastAsia="ru-RU"/>
           <w14:ligatures w14:val="none"/>
         </w:rPr>
-        <w:t>g</w:t>
+        <w:t>side</w:t>
       </w:r>
       <w:r>
         <w:rPr>
@@ -6139,12 +5977,12 @@
           <w:lang w:eastAsia="ru-RU"/>
           <w14:ligatures w14:val="none"/>
         </w:rPr>
-        <w:t>_</w:t>
+        <w:t xml:space="preserve"> ==</w:t>
       </w:r>
       <w:r>
         <w:rPr>
           <w:rFonts w:ascii="Consolas" w:eastAsia="Times New Roman" w:hAnsi="Consolas" w:cs="Times New Roman"/>
-          <w:color w:val="BBBEBF"/>
+          <w:color w:val="569CD6"/>
           <w:kern w:val="0"/>
           <w:sz w:val="21"/>
           <w:szCs w:val="21"/>
@@ -6152,7 +5990,63 @@
           <w:lang w:val="en-AU" w:eastAsia="ru-RU"/>
           <w14:ligatures w14:val="none"/>
         </w:rPr>
-        <w:t>and</w:t>
+        <w:t>true</w:t>
+      </w:r>
+      <w:r>
+        <w:rPr>
+          <w:b/>
+          <w:bCs/>
+        </w:rPr>
+        <w:t>)</w:t>
+      </w:r>
+      <w:r>
+        <w:rPr>
+          <w:b/>
+          <w:bCs/>
+        </w:rPr>
+        <w:t xml:space="preserve"> И</w:t>
+      </w:r>
+      <w:r>
+        <w:rPr>
+          <w:b/>
+          <w:bCs/>
+        </w:rPr>
+        <w:br/>
+      </w:r>
+      <w:r>
+        <w:rPr>
+          <w:b/>
+          <w:bCs/>
+        </w:rPr>
+        <w:t xml:space="preserve"> </w:t>
+      </w:r>
+      <w:r>
+        <w:rPr>
+          <w:b/>
+          <w:bCs/>
+        </w:rPr>
+        <w:t>всегда</w:t>
+      </w:r>
+      <w:r>
+        <w:rPr>
+          <w:b/>
+          <w:bCs/>
+        </w:rPr>
+        <w:t>_</w:t>
+      </w:r>
+      <w:r>
+        <w:rPr>
+          <w:b/>
+          <w:bCs/>
+        </w:rPr>
+        <w:t>выполняется</w:t>
+      </w:r>
+      <w:r>
+        <w:rPr>
+          <w:b/>
+          <w:bCs/>
+        </w:rPr>
+        <w:t>(</w:t>
       </w:r>
       <w:r>
         <w:rPr>
@@ -6165,7 +6059,7 @@
           <w:lang w:eastAsia="ru-RU"/>
           <w14:ligatures w14:val="none"/>
         </w:rPr>
-        <w:t>_</w:t>
+        <w:t>(</w:t>
       </w:r>
       <w:r>
         <w:rPr>
@@ -6178,7 +6072,7 @@
           <w:lang w:val="en-AU" w:eastAsia="ru-RU"/>
           <w14:ligatures w14:val="none"/>
         </w:rPr>
-        <w:t>c</w:t>
+        <w:t>g</w:t>
       </w:r>
       <w:r>
         <w:rPr>
@@ -6191,12 +6085,12 @@
           <w:lang w:eastAsia="ru-RU"/>
           <w14:ligatures w14:val="none"/>
         </w:rPr>
-        <w:t xml:space="preserve"> == </w:t>
+        <w:t>_</w:t>
       </w:r>
       <w:r>
         <w:rPr>
           <w:rFonts w:ascii="Consolas" w:eastAsia="Times New Roman" w:hAnsi="Consolas" w:cs="Times New Roman"/>
-          <w:color w:val="569CD6"/>
+          <w:color w:val="BBBEBF"/>
           <w:kern w:val="0"/>
           <w:sz w:val="21"/>
           <w:szCs w:val="21"/>
@@ -6204,7 +6098,7 @@
           <w:lang w:val="en-AU" w:eastAsia="ru-RU"/>
           <w14:ligatures w14:val="none"/>
         </w:rPr>
-        <w:t>false</w:t>
+        <w:t>and</w:t>
       </w:r>
       <w:r>
         <w:rPr>
@@ -6217,7 +6111,7 @@
           <w:lang w:eastAsia="ru-RU"/>
           <w14:ligatures w14:val="none"/>
         </w:rPr>
-        <w:t>) &amp;&amp; (</w:t>
+        <w:t>_</w:t>
       </w:r>
       <w:r>
         <w:rPr>
@@ -6230,7 +6124,7 @@
           <w:lang w:val="en-AU" w:eastAsia="ru-RU"/>
           <w14:ligatures w14:val="none"/>
         </w:rPr>
-        <w:t>w</w:t>
+        <w:t>c</w:t>
       </w:r>
       <w:r>
         <w:rPr>
@@ -6243,12 +6137,12 @@
           <w:lang w:eastAsia="ru-RU"/>
           <w14:ligatures w14:val="none"/>
         </w:rPr>
-        <w:t>_</w:t>
+        <w:t xml:space="preserve"> == </w:t>
       </w:r>
       <w:r>
         <w:rPr>
           <w:rFonts w:ascii="Consolas" w:eastAsia="Times New Roman" w:hAnsi="Consolas" w:cs="Times New Roman"/>
-          <w:color w:val="BBBEBF"/>
+          <w:color w:val="569CD6"/>
           <w:kern w:val="0"/>
           <w:sz w:val="21"/>
           <w:szCs w:val="21"/>
@@ -6256,7 +6150,7 @@
           <w:lang w:val="en-AU" w:eastAsia="ru-RU"/>
           <w14:ligatures w14:val="none"/>
         </w:rPr>
-        <w:t>and</w:t>
+        <w:t>false</w:t>
       </w:r>
       <w:r>
         <w:rPr>
@@ -6269,7 +6163,7 @@
           <w:lang w:eastAsia="ru-RU"/>
           <w14:ligatures w14:val="none"/>
         </w:rPr>
-        <w:t>_</w:t>
+        <w:t>) &amp;&amp; (</w:t>
       </w:r>
       <w:r>
         <w:rPr>
@@ -6282,7 +6176,7 @@
           <w:lang w:val="en-AU" w:eastAsia="ru-RU"/>
           <w14:ligatures w14:val="none"/>
         </w:rPr>
-        <w:t>g</w:t>
+        <w:t>w</w:t>
       </w:r>
       <w:r>
         <w:rPr>
@@ -6295,12 +6189,12 @@
           <w:lang w:eastAsia="ru-RU"/>
           <w14:ligatures w14:val="none"/>
         </w:rPr>
-        <w:t xml:space="preserve"> == </w:t>
+        <w:t>_</w:t>
       </w:r>
       <w:r>
         <w:rPr>
           <w:rFonts w:ascii="Consolas" w:eastAsia="Times New Roman" w:hAnsi="Consolas" w:cs="Times New Roman"/>
-          <w:color w:val="569CD6"/>
+          <w:color w:val="BBBEBF"/>
           <w:kern w:val="0"/>
           <w:sz w:val="21"/>
           <w:szCs w:val="21"/>
@@ -6308,7 +6202,7 @@
           <w:lang w:val="en-AU" w:eastAsia="ru-RU"/>
           <w14:ligatures w14:val="none"/>
         </w:rPr>
-        <w:t>false</w:t>
+        <w:t>and</w:t>
       </w:r>
       <w:r>
         <w:rPr>
@@ -6321,6 +6215,58 @@
           <w:lang w:eastAsia="ru-RU"/>
           <w14:ligatures w14:val="none"/>
         </w:rPr>
+        <w:t>_</w:t>
+      </w:r>
+      <w:r>
+        <w:rPr>
+          <w:rFonts w:ascii="Consolas" w:eastAsia="Times New Roman" w:hAnsi="Consolas" w:cs="Times New Roman"/>
+          <w:color w:val="BBBEBF"/>
+          <w:kern w:val="0"/>
+          <w:sz w:val="21"/>
+          <w:szCs w:val="21"/>
+          <w:highlight w:val="black"/>
+          <w:lang w:val="en-AU" w:eastAsia="ru-RU"/>
+          <w14:ligatures w14:val="none"/>
+        </w:rPr>
+        <w:t>g</w:t>
+      </w:r>
+      <w:r>
+        <w:rPr>
+          <w:rFonts w:ascii="Consolas" w:eastAsia="Times New Roman" w:hAnsi="Consolas" w:cs="Times New Roman"/>
+          <w:color w:val="BBBEBF"/>
+          <w:kern w:val="0"/>
+          <w:sz w:val="21"/>
+          <w:szCs w:val="21"/>
+          <w:highlight w:val="black"/>
+          <w:lang w:eastAsia="ru-RU"/>
+          <w14:ligatures w14:val="none"/>
+        </w:rPr>
+        <w:t xml:space="preserve"> == </w:t>
+      </w:r>
+      <w:r>
+        <w:rPr>
+          <w:rFonts w:ascii="Consolas" w:eastAsia="Times New Roman" w:hAnsi="Consolas" w:cs="Times New Roman"/>
+          <w:color w:val="569CD6"/>
+          <w:kern w:val="0"/>
+          <w:sz w:val="21"/>
+          <w:szCs w:val="21"/>
+          <w:highlight w:val="black"/>
+          <w:lang w:val="en-AU" w:eastAsia="ru-RU"/>
+          <w14:ligatures w14:val="none"/>
+        </w:rPr>
+        <w:t>false</w:t>
+      </w:r>
+      <w:r>
+        <w:rPr>
+          <w:rFonts w:ascii="Consolas" w:eastAsia="Times New Roman" w:hAnsi="Consolas" w:cs="Times New Roman"/>
+          <w:color w:val="BBBEBF"/>
+          <w:kern w:val="0"/>
+          <w:sz w:val="21"/>
+          <w:szCs w:val="21"/>
+          <w:highlight w:val="black"/>
+          <w:lang w:eastAsia="ru-RU"/>
+          <w14:ligatures w14:val="none"/>
+        </w:rPr>
         <w:t>)</w:t>
       </w:r>
       <w:r>
@@ -6339,9 +6285,6 @@
     <w:p>
       <w:pPr>
         <w:pStyle w:val="a7"/>
-        <w:rPr>
-          <w:lang w:val="en-AU"/>
-        </w:rPr>
       </w:pPr>
     </w:p>
     <w:p>
@@ -6350,6 +6293,7 @@
       </w:pPr>
       <w:r>
         <w:rPr>
+          <w:noProof/>
           <w:lang w:val="en-AU"/>
         </w:rPr>
         <w:drawing>
@@ -7100,6 +7044,7 @@
   <w:style w:type="character" w:default="1" w:styleId="a0">
     <w:name w:val="Default Paragraph Font"/>
     <w:uiPriority w:val="1"/>
+    <w:semiHidden/>
     <w:unhideWhenUsed/>
   </w:style>
   <w:style w:type="table" w:default="1" w:styleId="a1">

</xml_diff>